<commit_message>
Publish methodology without draft labels
</commit_message>
<xml_diff>
--- a/static/downloads/digital-solutions-sales-n8n-websites.docx
+++ b/static/downloads/digital-solutions-sales-n8n-websites.docx
@@ -20,7 +20,7 @@
     </w:p>
     <w:p>
       <w:r>
-        <w:t>Авторская методичка ДИС • Степанов Д.А. • Черновик для обсуждения • Версия 1 от 07.10.2026</w:t>
+        <w:t>Авторская методичка ДИС • Степанов Д.А. • Методичка • Версия 1 от 07.10.2026</w:t>
       </w:r>
     </w:p>
     <w:p>
@@ -7476,7 +7476,7 @@
       <w:rPr>
         <w:sz w:val="18"/>
       </w:rPr>
-      <w:t>ДИС   •   Практическая методичка   •   Черновик 1</w:t>
+      <w:t>ДИС   •   Практическая методичка   •   Версия 1</w:t>
     </w:r>
   </w:p>
 </w:hdr>

</xml_diff>